<commit_message>
Update data quality report and regression predictions
Co-authored-by: Copilot <223556219+Copilot@users.noreply.github.com>
</commit_message>
<xml_diff>
--- a/docs/data_quality_results_and_recovery_recommendations.docx
+++ b/docs/data_quality_results_and_recovery_recommendations.docx
@@ -321,29 +321,7 @@
         <w:t>The merged dataset contains 456,548 rows and 15 columns, with no missing values or duplicate keys detected. The price and order-count flags require review rather than automatic correction. Missing weeks may reflect meals that were not offered, so they should not be imputed as zero orders without confirmation. These findings are descriptive and do not establish the cause of any flagged value.</w:t>
       </w:r>
     </w:p>
-    <w:p>
-      <w:pPr>
-        <w:pStyle w:val="Heading1"/>
-      </w:pPr>
-      <w:r>
-        <w:t>Recommended next steps</w:t>
-      </w:r>
-    </w:p>
-    <w:p>
-      <w:r>
-        <w:t>1. Validate the flagged prices with the applicable pricing and promotion rules.</w:t>
-      </w:r>
-    </w:p>
-    <w:p>
-      <w:r>
-        <w:t>2. Review a sample of IQR-flagged orders against adjacent weeks and operational/promotion records; correct only proven data errors.</w:t>
-      </w:r>
-    </w:p>
-    <w:p>
-      <w:r>
-        <w:t>3. Confirm meal availability for center-meal-week gaps; retrieve missing source records where appropriate, and keep unavailable/unknown values distinct from confirmed zero orders.</w:t>
-      </w:r>
-    </w:p>
+    <w:p/>
     <w:sectPr>
       <w:pgSz w:w="12240" w:h="15840"/>
       <w:pgMar w:top="900" w:right="900" w:bottom="900" w:left="900" w:header="450" w:footer="450" w:gutter="0"/>

</xml_diff>